<commit_message>
tex2docx: write x→a under lim (limLow) everywhere
Co-Authored-By: Claude Opus 5.5 <noreply@anthropic.com>
Claude-Session: https://claude.ai/code/session_015WVgZKTbSWpZTjn6aZsqC9
</commit_message>
<xml_diff>
--- a/documents/complexes/molakhas_cplx_3as.docx
+++ b/documents/complexes/molakhas_cplx_3as.docx
@@ -43486,7 +43486,7 @@
               <w:t xml:space="preserve"> </w:t>
             </w:r>
             <m:oMath>
-              <m:sSub>
+              <m:limLow>
                 <m:e>
                   <m:r>
                     <m:rPr>
@@ -43495,7 +43495,7 @@
                     <m:t>lim</m:t>
                   </m:r>
                 </m:e>
-                <m:sub>
+                <m:lim>
                   <m:r>
                     <m:t>n</m:t>
                   </m:r>
@@ -43517,8 +43517,8 @@
                     </m:rPr>
                     <m:t>∞</m:t>
                   </m:r>
-                </m:sub>
-              </m:sSub>
+                </m:lim>
+              </m:limLow>
               <m:r>
                 <m:t>O</m:t>
               </m:r>

</xml_diff>